<commit_message>
Eighth revision: stop calling the nested quantities intervals, withdraw the cluster bootstrap over factorial design points, and lead with the range the outer counts can actually determine
</commit_message>
<xml_diff>
--- a/repo/explainer/文章解读_中文.docx
+++ b/repo/explainer/文章解读_中文.docx
@@ -51,7 +51,7 @@
     </w:p>
     <w:p>
       <w:pPr>
-        <w:spacing w:after="140" w:line="254"/>
+        <w:spacing w:after="140" w:line="240"/>
         <w:jc w:val="both"/>
       </w:pPr>
       <w:r>
@@ -102,7 +102,7 @@
           <w:sz w:val="19"/>
           <w:szCs w:val="19"/>
         </w:rPr>
-        <w:t xml:space="preserve">：点估计在 colon 是 63.4%、Rotterdam 是 57.1%，但把不确定性做到病人层面之后，区间都包含 0.5。它落在「人数—风险比」经验前沿上的比例只有 3.0% 和 1.0%；不过这个前沿本身是从同一批留出数据里挑最优挑出来的，带乐观偏倚，我们另外量化了这个偏倚有多大。至于疗效估计要多少数据才够：在我们模拟的这些机制里，</w:t>
+        <w:t xml:space="preserve">：点估计在 colon 是 63.4%、Rotterdam 是 57.1%，但把病人重抽的波动算进来之后，这个比例的中间 80% 范围约占单位区间的三分之一，且横跨 0.5。它落在「人数—风险比」经验前沿上的比例只有 3.0% 和 1.0%；不过这个前沿本身是从同一批留出数据里挑最优挑出来的，带乐观偏倚，我们另外量化了这个偏倚有多大。至于疗效估计要多少数据才够：在我们模拟的这些机制里，</w:t>
       </w:r>
       <w:r>
         <w:rPr>
@@ -163,7 +163,7 @@
     </w:p>
     <w:p>
       <w:pPr>
-        <w:spacing w:after="68" w:line="254"/>
+        <w:spacing w:after="52" w:line="240"/>
         <w:jc w:val="both"/>
       </w:pPr>
       <w:r>
@@ -179,7 +179,7 @@
     </w:p>
     <w:p>
       <w:pPr>
-        <w:spacing w:after="68" w:line="254"/>
+        <w:spacing w:after="52" w:line="240"/>
         <w:jc w:val="both"/>
       </w:pPr>
       <w:r>
@@ -211,7 +211,7 @@
     </w:p>
     <w:p>
       <w:pPr>
-        <w:spacing w:after="52" w:line="258"/>
+        <w:spacing w:after="44" w:line="250"/>
         <w:ind w:left="300" w:hanging="300"/>
         <w:jc w:val="both"/>
       </w:pPr>
@@ -239,7 +239,7 @@
     </w:p>
     <w:p>
       <w:pPr>
-        <w:spacing w:after="52" w:line="258"/>
+        <w:spacing w:after="44" w:line="250"/>
         <w:ind w:left="300" w:hanging="300"/>
         <w:jc w:val="both"/>
       </w:pPr>
@@ -287,7 +287,7 @@
     </w:p>
     <w:p>
       <w:pPr>
-        <w:spacing w:after="52" w:line="258"/>
+        <w:spacing w:after="44" w:line="250"/>
         <w:ind w:left="300" w:hanging="300"/>
         <w:jc w:val="both"/>
       </w:pPr>
@@ -315,7 +315,7 @@
     </w:p>
     <w:p>
       <w:pPr>
-        <w:spacing w:after="52" w:line="258"/>
+        <w:spacing w:after="44" w:line="250"/>
         <w:ind w:left="300" w:hanging="300"/>
         <w:jc w:val="both"/>
       </w:pPr>
@@ -363,7 +363,7 @@
     </w:p>
     <w:p>
       <w:pPr>
-        <w:spacing w:after="68" w:line="254"/>
+        <w:spacing w:after="52" w:line="240"/>
         <w:jc w:val="both"/>
       </w:pPr>
       <w:r>
@@ -410,7 +410,7 @@
     </w:p>
     <w:p>
       <w:pPr>
-        <w:spacing w:after="68" w:line="254"/>
+        <w:spacing w:after="52" w:line="240"/>
         <w:jc w:val="both"/>
       </w:pPr>
       <w:r>
@@ -426,7 +426,7 @@
     </w:p>
     <w:p>
       <w:pPr>
-        <w:spacing w:after="68" w:line="254"/>
+        <w:spacing w:after="52" w:line="240"/>
         <w:jc w:val="both"/>
       </w:pPr>
       <w:r>
@@ -467,22 +467,22 @@
           <w:sz w:val="19"/>
           <w:szCs w:val="19"/>
         </w:rPr>
-        <w:t xml:space="preserve">所有这些区间都包含 0.5</w:t>
-      </w:r>
-      <w:r>
-        <w:rPr>
-          <w:rFonts w:ascii="Noto Serif CJK SC" w:cs="Noto Serif CJK SC" w:eastAsia="Noto Serif CJK SC" w:hAnsi="Noto Serif CJK SC"/>
-          <w:b w:val="false"/>
-          <w:bCs w:val="false"/>
-          <w:sz w:val="19"/>
-          <w:szCs w:val="19"/>
-        </w:rPr>
-        <w:t xml:space="preserve">——既证不出优势，也证不出没有优势。这是我们第三轮之后最重要的一处措辞改动。</w:t>
-      </w:r>
-    </w:p>
-    <w:p>
-      <w:pPr>
-        <w:spacing w:after="68" w:line="254"/>
+        <w:t xml:space="preserve">重抽病人时这些范围各自约占单位区间的四分之一到三成，且横跨 0.5</w:t>
+      </w:r>
+      <w:r>
+        <w:rPr>
+          <w:rFonts w:ascii="Noto Serif CJK SC" w:cs="Noto Serif CJK SC" w:eastAsia="Noto Serif CJK SC" w:hAnsi="Noto Serif CJK SC"/>
+          <w:b w:val="false"/>
+          <w:bCs w:val="false"/>
+          <w:sz w:val="19"/>
+          <w:szCs w:val="19"/>
+        </w:rPr>
+        <w:t xml:space="preserve">——我们不把它当检验，也不据此对总体值下任何结论。这是我们第三轮之后最重要的一处措辞改动。</w:t>
+      </w:r>
+    </w:p>
+    <w:p>
+      <w:pPr>
+        <w:spacing w:after="52" w:line="240"/>
         <w:jc w:val="both"/>
       </w:pPr>
       <w:r>
@@ -518,7 +518,7 @@
     </w:p>
     <w:p>
       <w:pPr>
-        <w:spacing w:after="68" w:line="254"/>
+        <w:spacing w:after="52" w:line="240"/>
         <w:jc w:val="both"/>
       </w:pPr>
       <w:r>
@@ -1183,7 +1183,7 @@
     </w:p>
     <w:p>
       <w:pPr>
-        <w:spacing w:after="68" w:line="254"/>
+        <w:spacing w:after="52" w:line="240"/>
         <w:jc w:val="both"/>
       </w:pPr>
       <w:r>
@@ -1234,7 +1234,7 @@
     </w:p>
     <w:p>
       <w:pPr>
-        <w:spacing w:after="68" w:line="254"/>
+        <w:spacing w:after="52" w:line="240"/>
         <w:jc w:val="both"/>
       </w:pPr>
       <w:r>
@@ -1290,7 +1290,7 @@
     </w:p>
     <w:p>
       <w:pPr>
-        <w:spacing w:after="68" w:line="254"/>
+        <w:spacing w:after="52" w:line="240"/>
         <w:jc w:val="both"/>
       </w:pPr>
       <w:r>
@@ -1326,7 +1326,7 @@
     </w:p>
     <w:p>
       <w:pPr>
-        <w:spacing w:after="68" w:line="254"/>
+        <w:spacing w:after="52" w:line="240"/>
         <w:jc w:val="both"/>
       </w:pPr>
       <w:r>
@@ -1342,7 +1342,7 @@
     </w:p>
     <w:p>
       <w:pPr>
-        <w:spacing w:after="68" w:line="254"/>
+        <w:spacing w:after="52" w:line="240"/>
         <w:jc w:val="both"/>
       </w:pPr>
       <w:r>
@@ -1418,7 +1418,7 @@
     </w:p>
     <w:p>
       <w:pPr>
-        <w:spacing w:after="68" w:line="254"/>
+        <w:spacing w:after="52" w:line="240"/>
         <w:jc w:val="both"/>
       </w:pPr>
       <w:r>
@@ -1469,7 +1469,7 @@
     </w:p>
     <w:p>
       <w:pPr>
-        <w:spacing w:after="68" w:line="254"/>
+        <w:spacing w:after="52" w:line="240"/>
         <w:jc w:val="both"/>
       </w:pPr>
       <w:r>
@@ -1540,7 +1540,7 @@
     </w:p>
     <w:p>
       <w:pPr>
-        <w:spacing w:after="68" w:line="254"/>
+        <w:spacing w:after="52" w:line="240"/>
         <w:jc w:val="both"/>
       </w:pPr>
       <w:r>
@@ -1576,7 +1576,7 @@
     </w:p>
     <w:p>
       <w:pPr>
-        <w:spacing w:after="68" w:line="254"/>
+        <w:spacing w:after="52" w:line="240"/>
         <w:jc w:val="both"/>
       </w:pPr>
       <w:r>
@@ -1608,7 +1608,7 @@
     </w:p>
     <w:p>
       <w:pPr>
-        <w:spacing w:after="52" w:line="258"/>
+        <w:spacing w:after="44" w:line="250"/>
         <w:ind w:left="300" w:hanging="300"/>
         <w:jc w:val="both"/>
       </w:pPr>
@@ -1651,12 +1651,12 @@
           <w:sz w:val="19"/>
           <w:szCs w:val="19"/>
         </w:rPr>
-        <w:t xml:space="preserve">：穷举枚举下任何尺度都精确成立（验证到 2.2e-16 和 8.3e-17）。同一稿把「多纳入病人」当成经过验证的收益，其实是构造性的（见发现 1）；两处均已全文改写。</w:t>
-      </w:r>
-    </w:p>
-    <w:p>
-      <w:pPr>
-        <w:spacing w:after="52" w:line="258"/>
+        <w:t xml:space="preserve">：穷举枚举下任何尺度都精确成立（2.2e-16 和 8.3e-17）。同一稿又把「多纳入病人」当成经过验证的收益，其实是构造性的；两处均已改写。</w:t>
+      </w:r>
+    </w:p>
+    <w:p>
+      <w:pPr>
+        <w:spacing w:after="44" w:line="250"/>
         <w:ind w:left="300" w:hanging="300"/>
         <w:jc w:val="both"/>
       </w:pPr>
@@ -1704,7 +1704,7 @@
     </w:p>
     <w:p>
       <w:pPr>
-        <w:spacing w:after="52" w:line="258"/>
+        <w:spacing w:after="44" w:line="250"/>
         <w:ind w:left="300" w:hanging="300"/>
         <w:jc w:val="both"/>
       </w:pPr>
@@ -1727,7 +1727,7 @@
           <w:sz w:val="19"/>
           <w:szCs w:val="19"/>
         </w:rPr>
-        <w:t xml:space="preserve">第二轮：嵌套自助有泄漏——自助样本里同一病人的副本可能落到划分两侧；已按病人 ID 划分并加断言，重算后区间变窄。同一轮里，只用「能观察到阈值」的 6 个情景算离散度有选择偏倚，据此得出的结论</w:t>
+        <w:t xml:space="preserve">第二轮：嵌套自助有泄漏——同一病人的副本可能落到划分两侧；已按病人 ID 划分并加断言。同一轮里，只用「能观察到阈值」的 6 个情景算离散度有选择偏倚，结论</w:t>
       </w:r>
       <w:r>
         <w:rPr>
@@ -1752,7 +1752,7 @@
     </w:p>
     <w:p>
       <w:pPr>
-        <w:spacing w:after="52" w:line="258"/>
+        <w:spacing w:after="44" w:line="250"/>
         <w:ind w:left="300" w:hanging="300"/>
         <w:jc w:val="both"/>
       </w:pPr>
@@ -1800,7 +1800,7 @@
     </w:p>
     <w:p>
       <w:pPr>
-        <w:spacing w:after="52" w:line="258"/>
+        <w:spacing w:after="44" w:line="250"/>
         <w:ind w:left="300" w:hanging="300"/>
         <w:jc w:val="both"/>
       </w:pPr>
@@ -1828,7 +1828,7 @@
     </w:p>
     <w:p>
       <w:pPr>
-        <w:spacing w:after="52" w:line="258"/>
+        <w:spacing w:after="44" w:line="250"/>
         <w:ind w:left="300" w:hanging="300"/>
         <w:jc w:val="both"/>
       </w:pPr>
@@ -1851,32 +1851,32 @@
           <w:sz w:val="19"/>
           <w:szCs w:val="19"/>
         </w:rPr>
-        <w:t xml:space="preserve">第四轮：正文和补充材料对同一个量给出不同的数，我们上一轮把它解释成蒙特卡洛噪声。真正的原因要糟得多——第二、三轮新增的 </w:t>
-      </w:r>
-      <w:r>
-        <w:rPr>
-          <w:rFonts w:ascii="Noto Sans CJK SC" w:cs="Noto Sans CJK SC" w:eastAsia="Noto Sans CJK SC" w:hAnsi="Noto Sans CJK SC"/>
-          <w:b/>
-          <w:bCs/>
-          <w:sz w:val="19"/>
-          <w:szCs w:val="19"/>
-        </w:rPr>
-        <w:t xml:space="preserve">11 个脚本把 Rotterdam 的终点写成了「无复发生存时间 + 死亡指示」在 1825 天截断</w:t>
-      </w:r>
-      <w:r>
-        <w:rPr>
-          <w:rFonts w:ascii="Noto Serif CJK SC" w:cs="Noto Serif CJK SC" w:eastAsia="Noto Serif CJK SC" w:hAnsi="Noto Serif CJK SC"/>
-          <w:b w:val="false"/>
-          <w:bCs w:val="false"/>
-          <w:sz w:val="19"/>
-          <w:szCs w:val="19"/>
-        </w:rPr>
-        <w:t xml:space="preserve">，而表 1 用的是正确的「死亡时间 + 死亡指示」在 2555 天截断。时间和事件指示不配对，会系统性缩短事件时间。这不是两次运行的差异，是两个不同的终点。已全部改正并重算。</w:t>
-      </w:r>
-    </w:p>
-    <w:p>
-      <w:pPr>
-        <w:spacing w:after="52" w:line="258"/>
+        <w:t xml:space="preserve">第四轮：正文和补充材料对同一个量给出不同的数，我们上一轮解释成蒙特卡洛噪声。真正原因要糟得多——第二、三轮新增的 </w:t>
+      </w:r>
+      <w:r>
+        <w:rPr>
+          <w:rFonts w:ascii="Noto Sans CJK SC" w:cs="Noto Sans CJK SC" w:eastAsia="Noto Sans CJK SC" w:hAnsi="Noto Sans CJK SC"/>
+          <w:b/>
+          <w:bCs/>
+          <w:sz w:val="19"/>
+          <w:szCs w:val="19"/>
+        </w:rPr>
+        <w:t xml:space="preserve">11 个脚本把 Rotterdam 的终点写成「无复发生存时间 + 死亡指示」并在 1825 天截断</w:t>
+      </w:r>
+      <w:r>
+        <w:rPr>
+          <w:rFonts w:ascii="Noto Serif CJK SC" w:cs="Noto Serif CJK SC" w:eastAsia="Noto Serif CJK SC" w:hAnsi="Noto Serif CJK SC"/>
+          <w:b w:val="false"/>
+          <w:bCs w:val="false"/>
+          <w:sz w:val="19"/>
+          <w:szCs w:val="19"/>
+        </w:rPr>
+        <w:t xml:space="preserve">，而表 1 用的是「死亡时间 + 死亡指示」在 2555 天截断。时间和事件指示不配对会系统性缩短事件时间。这是两个不同的终点，不是两次运行的差异。已全部改正并重算。</w:t>
+      </w:r>
+    </w:p>
+    <w:p>
+      <w:pPr>
+        <w:spacing w:after="44" w:line="250"/>
         <w:ind w:left="300" w:hanging="300"/>
         <w:jc w:val="both"/>
       </w:pPr>
@@ -1919,52 +1919,32 @@
           <w:sz w:val="19"/>
           <w:szCs w:val="19"/>
         </w:rPr>
-        <w:t xml:space="preserve">——外层自助每抽一次只做 25 次内层划分，点估计却用 400/500 次，区间因此混进了内层蒙特卡洛方差、偏宽。我们注意到了症状（两次运行最多差 0.14）却没顺着它得出结论。新增的表 S1e 把长运行切成互不重叠的小块，给出</w:t>
-      </w:r>
-      <w:r>
-        <w:rPr>
-          <w:rFonts w:ascii="Noto Sans CJK SC" w:cs="Noto Sans CJK SC" w:eastAsia="Noto Sans CJK SC" w:hAnsi="Noto Sans CJK SC"/>
-          <w:b/>
-          <w:bCs/>
-          <w:sz w:val="19"/>
-          <w:szCs w:val="19"/>
-        </w:rPr>
-        <w:t xml:space="preserve">独立的 R 次划分估计的实测离散度和均值</w:t>
-      </w:r>
-      <w:r>
-        <w:rPr>
-          <w:rFonts w:ascii="Noto Serif CJK SC" w:cs="Noto Serif CJK SC" w:eastAsia="Noto Serif CJK SC" w:hAnsi="Noto Serif CJK SC"/>
-          <w:b w:val="false"/>
-          <w:bCs w:val="false"/>
-          <w:sz w:val="19"/>
-          <w:szCs w:val="19"/>
-        </w:rPr>
-        <w:t xml:space="preserve">，而不是只给 s/√R 这个恒等式；表 S3、S3c 对每个量同时给出原始区间和压掉内层方差后的区间，并报告端点自身的蒙特卡洛误差。口径也改了：这些区间</w:t>
-      </w:r>
-      <w:r>
-        <w:rPr>
-          <w:rFonts w:ascii="Noto Sans CJK SC" w:cs="Noto Sans CJK SC" w:eastAsia="Noto Sans CJK SC" w:hAnsi="Noto Sans CJK SC"/>
-          <w:b/>
-          <w:bCs/>
-          <w:sz w:val="19"/>
-          <w:szCs w:val="19"/>
-        </w:rPr>
-        <w:t xml:space="preserve">近似、覆盖率未经验证</w:t>
-      </w:r>
-      <w:r>
-        <w:rPr>
-          <w:rFonts w:ascii="Noto Serif CJK SC" w:cs="Noto Serif CJK SC" w:eastAsia="Noto Serif CJK SC" w:hAnsi="Noto Serif CJK SC"/>
-          <w:b w:val="false"/>
-          <w:bCs w:val="false"/>
-          <w:sz w:val="19"/>
-          <w:szCs w:val="19"/>
-        </w:rPr>
-        <w:t xml:space="preserve">，confirmatory（确证）一词已全部撤下。</w:t>
-      </w:r>
-    </w:p>
-    <w:p>
-      <w:pPr>
-        <w:spacing w:after="52" w:line="258"/>
+        <w:t xml:space="preserve">——外层自助每抽一次只做 25 次内层划分，点估计却用 400/500 次，区间因此混进了内层蒙特卡洛方差、偏宽。我们注意到了症状（两次运行最多差 0.14）却没顺着它得出结论。新增表 S1e 把长运行切成互不重叠的小块，给出</w:t>
+      </w:r>
+      <w:r>
+        <w:rPr>
+          <w:rFonts w:ascii="Noto Sans CJK SC" w:cs="Noto Sans CJK SC" w:eastAsia="Noto Sans CJK SC" w:hAnsi="Noto Sans CJK SC"/>
+          <w:b/>
+          <w:bCs/>
+          <w:sz w:val="19"/>
+          <w:szCs w:val="19"/>
+        </w:rPr>
+        <w:t xml:space="preserve">独立 R 次划分估计的实测离散度和均值</w:t>
+      </w:r>
+      <w:r>
+        <w:rPr>
+          <w:rFonts w:ascii="Noto Serif CJK SC" w:cs="Noto Serif CJK SC" w:eastAsia="Noto Serif CJK SC" w:hAnsi="Noto Serif CJK SC"/>
+          <w:b w:val="false"/>
+          <w:bCs w:val="false"/>
+          <w:sz w:val="19"/>
+          <w:szCs w:val="19"/>
+        </w:rPr>
+        <w:t xml:space="preserve">，而不只是 s/√R 这个恒等式；表 S3、S3c 同时给出原始与压缩后的区间及端点误差。confirmatory（确证）一词已全部撤下。</w:t>
+      </w:r>
+    </w:p>
+    <w:p>
+      <w:pPr>
+        <w:spacing w:after="44" w:line="250"/>
         <w:ind w:left="300" w:hanging="300"/>
         <w:jc w:val="both"/>
       </w:pPr>
@@ -1987,7 +1967,7 @@
           <w:sz w:val="19"/>
           <w:szCs w:val="19"/>
         </w:rPr>
-        <w:t xml:space="preserve">第七轮自查：三种「信息货币」（人数／事件数／有效样本量）差值报的是</w:t>
+        <w:t xml:space="preserve">第七轮自查：三种「信息货币」的差值报的是</w:t>
       </w:r>
       <w:r>
         <w:rPr>
@@ -2007,12 +1987,256 @@
           <w:sz w:val="19"/>
           <w:szCs w:val="19"/>
         </w:rPr>
-        <w:t xml:space="preserve">而非观察值。每次重抽都会重切四分位边界，两者不但不等、符号还相反。现改报观察值，自助只给区间。</w:t>
-      </w:r>
-    </w:p>
-    <w:p>
-      <w:pPr>
-        <w:spacing w:after="52" w:line="258"/>
+        <w:t xml:space="preserve">而非观察值；每次重抽都重切四分位边界，两者不等且符号相反。已改报观察值。</w:t>
+      </w:r>
+    </w:p>
+    <w:p>
+      <w:pPr>
+        <w:spacing w:after="44" w:line="250"/>
+        <w:ind w:left="300" w:hanging="300"/>
+        <w:jc w:val="both"/>
+      </w:pPr>
+      <w:r>
+        <w:rPr>
+          <w:rFonts w:ascii="Noto Sans CJK SC" w:cs="Noto Sans CJK SC" w:eastAsia="Noto Sans CJK SC" w:hAnsi="Noto Sans CJK SC"/>
+          <w:b/>
+          <w:bCs/>
+          <w:color w:val="1A4B7A"/>
+          <w:sz w:val="19"/>
+          <w:szCs w:val="19"/>
+        </w:rPr>
+        <w:t xml:space="preserve">错误十（这一轮最重要）  </w:t>
+      </w:r>
+      <w:r>
+        <w:rPr>
+          <w:rFonts w:ascii="Noto Serif CJK SC" w:cs="Noto Serif CJK SC" w:eastAsia="Noto Serif CJK SC" w:hAnsi="Noto Serif CJK SC"/>
+          <w:b w:val="false"/>
+          <w:bCs w:val="false"/>
+          <w:sz w:val="19"/>
+          <w:szCs w:val="19"/>
+        </w:rPr>
+        <w:t xml:space="preserve">第八轮：压缩后的区间</w:t>
+      </w:r>
+      <w:r>
+        <w:rPr>
+          <w:rFonts w:ascii="Noto Sans CJK SC" w:cs="Noto Sans CJK SC" w:eastAsia="Noto Sans CJK SC" w:hAnsi="Noto Sans CJK SC"/>
+          <w:b/>
+          <w:bCs/>
+          <w:sz w:val="19"/>
+          <w:szCs w:val="19"/>
+        </w:rPr>
+        <w:t xml:space="preserve">不是验证过覆盖率的 95% 患者层面置信区间</w:t>
+      </w:r>
+      <w:r>
+        <w:rPr>
+          <w:rFonts w:ascii="Noto Serif CJK SC" w:cs="Noto Serif CJK SC" w:eastAsia="Noto Serif CJK SC" w:hAnsi="Noto Serif CJK SC"/>
+          <w:b w:val="false"/>
+          <w:bCs w:val="false"/>
+          <w:sz w:val="19"/>
+          <w:szCs w:val="19"/>
+        </w:rPr>
+        <w:t xml:space="preserve">。线性收缩只匹配到二阶矩，不能从「患者变异 ⊗ 蒙特卡洛噪声」的卷积里还原患者抽样分位数；统计量有界，流程里还有 Shapley 取符号和前沿挑选两个非光滑步骤。我们一边声明覆盖率未验证、一边用「是否跨过 0.5」下结论，仍是把未校准区间当正式推断。现全文不再出现「95% 区间」「患者层面区间」「置信区间」，改称</w:t>
+      </w:r>
+      <w:r>
+        <w:rPr>
+          <w:rFonts w:ascii="Noto Sans CJK SC" w:cs="Noto Sans CJK SC" w:eastAsia="Noto Sans CJK SC" w:hAnsi="Noto Sans CJK SC"/>
+          <w:b/>
+          <w:bCs/>
+          <w:sz w:val="19"/>
+          <w:szCs w:val="19"/>
+        </w:rPr>
+        <w:t xml:space="preserve">患者重抽范围</w:t>
+      </w:r>
+      <w:r>
+        <w:rPr>
+          <w:rFonts w:ascii="Noto Serif CJK SC" w:cs="Noto Serif CJK SC" w:eastAsia="Noto Serif CJK SC" w:hAnsi="Noto Serif CJK SC"/>
+          <w:b w:val="false"/>
+          <w:bCs w:val="false"/>
+          <w:sz w:val="19"/>
+          <w:szCs w:val="19"/>
+        </w:rPr>
+        <w:t xml:space="preserve">，并</w:t>
+      </w:r>
+      <w:r>
+        <w:rPr>
+          <w:rFonts w:ascii="Noto Sans CJK SC" w:cs="Noto Sans CJK SC" w:eastAsia="Noto Sans CJK SC" w:hAnsi="Noto Sans CJK SC"/>
+          <w:b/>
+          <w:bCs/>
+          <w:sz w:val="19"/>
+          <w:szCs w:val="19"/>
+        </w:rPr>
+        <w:t xml:space="preserve">删去所有依据是否跨过 0.5 或 0 的判断</w:t>
+      </w:r>
+      <w:r>
+        <w:rPr>
+          <w:rFonts w:ascii="Noto Serif CJK SC" w:cs="Noto Serif CJK SC" w:eastAsia="Noto Serif CJK SC" w:hAnsi="Noto Serif CJK SC"/>
+          <w:b w:val="false"/>
+          <w:bCs w:val="false"/>
+          <w:sz w:val="19"/>
+          <w:szCs w:val="19"/>
+        </w:rPr>
+        <w:t xml:space="preserve">；又因 100–150 次外层重抽下 2.5%／97.5% 端点只由第 3 个观测决定，改以</w:t>
+      </w:r>
+      <w:r>
+        <w:rPr>
+          <w:rFonts w:ascii="Noto Sans CJK SC" w:cs="Noto Sans CJK SC" w:eastAsia="Noto Sans CJK SC" w:hAnsi="Noto Sans CJK SC"/>
+          <w:b/>
+          <w:bCs/>
+          <w:sz w:val="19"/>
+          <w:szCs w:val="19"/>
+        </w:rPr>
+        <w:t xml:space="preserve">中间 80% 范围</w:t>
+      </w:r>
+      <w:r>
+        <w:rPr>
+          <w:rFonts w:ascii="Noto Serif CJK SC" w:cs="Noto Serif CJK SC" w:eastAsia="Noto Serif CJK SC" w:hAnsi="Noto Serif CJK SC"/>
+          <w:b w:val="false"/>
+          <w:bCs w:val="false"/>
+          <w:sz w:val="19"/>
+          <w:szCs w:val="19"/>
+        </w:rPr>
+        <w:t xml:space="preserve">为主。</w:t>
+      </w:r>
+    </w:p>
+    <w:p>
+      <w:pPr>
+        <w:spacing w:after="44" w:line="250"/>
+        <w:ind w:left="300" w:hanging="300"/>
+        <w:jc w:val="both"/>
+      </w:pPr>
+      <w:r>
+        <w:rPr>
+          <w:rFonts w:ascii="Noto Sans CJK SC" w:cs="Noto Sans CJK SC" w:eastAsia="Noto Sans CJK SC" w:hAnsi="Noto Sans CJK SC"/>
+          <w:b/>
+          <w:bCs/>
+          <w:color w:val="1A4B7A"/>
+          <w:sz w:val="19"/>
+          <w:szCs w:val="19"/>
+        </w:rPr>
+        <w:t xml:space="preserve">错误十一  </w:t>
+      </w:r>
+      <w:r>
+        <w:rPr>
+          <w:rFonts w:ascii="Noto Serif CJK SC" w:cs="Noto Serif CJK SC" w:eastAsia="Noto Serif CJK SC" w:hAnsi="Noto Serif CJK SC"/>
+          <w:b w:val="false"/>
+          <w:bCs w:val="false"/>
+          <w:sz w:val="19"/>
+          <w:szCs w:val="19"/>
+        </w:rPr>
+        <w:t xml:space="preserve">第八轮：方差差为非正时，正确结论是</w:t>
+      </w:r>
+      <w:r>
+        <w:rPr>
+          <w:rFonts w:ascii="Noto Sans CJK SC" w:cs="Noto Sans CJK SC" w:eastAsia="Noto Sans CJK SC" w:hAnsi="Noto Sans CJK SC"/>
+          <w:b/>
+          <w:bCs/>
+          <w:sz w:val="19"/>
+          <w:szCs w:val="19"/>
+        </w:rPr>
+        <w:t xml:space="preserve">当前蒙特卡洛精度下患者层面方差分量不可辨识</w:t>
+      </w:r>
+      <w:r>
+        <w:rPr>
+          <w:rFonts w:ascii="Noto Serif CJK SC" w:cs="Noto Serif CJK SC" w:eastAsia="Noto Serif CJK SC" w:hAnsi="Noto Serif CJK SC"/>
+          <w:b w:val="false"/>
+          <w:bCs w:val="false"/>
+          <w:sz w:val="19"/>
+          <w:szCs w:val="19"/>
+        </w:rPr>
+        <w:t xml:space="preserve">，既不能说它是零，也不能说「内层项吃掉了全部离散度」。前后两次都读错了，已在正文和表 S3、S3c 改正并注明撤回。</w:t>
+      </w:r>
+    </w:p>
+    <w:p>
+      <w:pPr>
+        <w:spacing w:after="44" w:line="250"/>
+        <w:ind w:left="300" w:hanging="300"/>
+        <w:jc w:val="both"/>
+      </w:pPr>
+      <w:r>
+        <w:rPr>
+          <w:rFonts w:ascii="Noto Sans CJK SC" w:cs="Noto Sans CJK SC" w:eastAsia="Noto Sans CJK SC" w:hAnsi="Noto Sans CJK SC"/>
+          <w:b/>
+          <w:bCs/>
+          <w:color w:val="1A4B7A"/>
+          <w:sz w:val="19"/>
+          <w:szCs w:val="19"/>
+        </w:rPr>
+        <w:t xml:space="preserve">错误十二  </w:t>
+      </w:r>
+      <w:r>
+        <w:rPr>
+          <w:rFonts w:ascii="Noto Serif CJK SC" w:cs="Noto Serif CJK SC" w:eastAsia="Noto Serif CJK SC" w:hAnsi="Noto Serif CJK SC"/>
+          <w:b w:val="false"/>
+          <w:bCs w:val="false"/>
+          <w:sz w:val="19"/>
+          <w:szCs w:val="19"/>
+        </w:rPr>
+        <w:t xml:space="preserve">第八轮：16 个情景是部分因子设计的</w:t>
+      </w:r>
+      <w:r>
+        <w:rPr>
+          <w:rFonts w:ascii="Noto Sans CJK SC" w:cs="Noto Sans CJK SC" w:eastAsia="Noto Sans CJK SC" w:hAnsi="Noto Sans CJK SC"/>
+          <w:b/>
+          <w:bCs/>
+          <w:sz w:val="19"/>
+          <w:szCs w:val="19"/>
+        </w:rPr>
+        <w:t xml:space="preserve">固定设计点</w:t>
+      </w:r>
+      <w:r>
+        <w:rPr>
+          <w:rFonts w:ascii="Noto Serif CJK SC" w:cs="Noto Serif CJK SC" w:eastAsia="Noto Serif CJK SC" w:hAnsi="Noto Serif CJK SC"/>
+          <w:b w:val="false"/>
+          <w:bCs w:val="false"/>
+          <w:sz w:val="19"/>
+          <w:szCs w:val="19"/>
+        </w:rPr>
+        <w:t xml:space="preserve">，不是从机制总体抽出的 cluster，对它们做整群自助没有可指涉的抽样总体。整群自助已</w:t>
+      </w:r>
+      <w:r>
+        <w:rPr>
+          <w:rFonts w:ascii="Noto Sans CJK SC" w:cs="Noto Sans CJK SC" w:eastAsia="Noto Sans CJK SC" w:hAnsi="Noto Sans CJK SC"/>
+          <w:b/>
+          <w:bCs/>
+          <w:sz w:val="19"/>
+          <w:szCs w:val="19"/>
+        </w:rPr>
+        <w:t xml:space="preserve">撤回</w:t>
+      </w:r>
+      <w:r>
+        <w:rPr>
+          <w:rFonts w:ascii="Noto Serif CJK SC" w:cs="Noto Serif CJK SC" w:eastAsia="Noto Serif CJK SC" w:hAnsi="Noto Serif CJK SC"/>
+          <w:b w:val="false"/>
+          <w:bCs w:val="false"/>
+          <w:sz w:val="19"/>
+          <w:szCs w:val="19"/>
+        </w:rPr>
+        <w:t xml:space="preserve">，改为固定设计下的</w:t>
+      </w:r>
+      <w:r>
+        <w:rPr>
+          <w:rFonts w:ascii="Noto Sans CJK SC" w:cs="Noto Sans CJK SC" w:eastAsia="Noto Sans CJK SC" w:hAnsi="Noto Sans CJK SC"/>
+          <w:b/>
+          <w:bCs/>
+          <w:sz w:val="19"/>
+          <w:szCs w:val="19"/>
+        </w:rPr>
+        <w:t xml:space="preserve">留一情景敏感性分析</w:t>
+      </w:r>
+      <w:r>
+        <w:rPr>
+          <w:rFonts w:ascii="Noto Serif CJK SC" w:cs="Noto Serif CJK SC" w:eastAsia="Noto Serif CJK SC" w:hAnsi="Noto Serif CJK SC"/>
+          <w:b w:val="false"/>
+          <w:bCs w:val="false"/>
+          <w:sz w:val="19"/>
+          <w:szCs w:val="19"/>
+        </w:rPr>
+        <w:t xml:space="preserve">（表 S2c），结论收窄为「在这一分箱下三个描述性汇总数值相近」。</w:t>
+      </w:r>
+    </w:p>
+    <w:p>
+      <w:pPr>
+        <w:spacing w:after="44" w:line="250"/>
         <w:ind w:left="300" w:hanging="300"/>
         <w:jc w:val="both"/>
       </w:pPr>
@@ -2076,7 +2300,7 @@
     </w:p>
     <w:p>
       <w:pPr>
-        <w:spacing w:after="52" w:line="258"/>
+        <w:spacing w:after="44" w:line="250"/>
         <w:ind w:left="300" w:hanging="300"/>
         <w:jc w:val="both"/>
       </w:pPr>
@@ -2124,7 +2348,7 @@
     </w:p>
     <w:p>
       <w:pPr>
-        <w:spacing w:after="52" w:line="258"/>
+        <w:spacing w:after="44" w:line="250"/>
         <w:ind w:left="300" w:hanging="300"/>
         <w:jc w:val="both"/>
       </w:pPr>
@@ -2147,12 +2371,12 @@
           <w:sz w:val="19"/>
           <w:szCs w:val="19"/>
         </w:rPr>
-        <w:t xml:space="preserve">若标准 i 逻辑上蕴含 j，这对的交互是算术恒等式，无论样本量多大都无信息，必须从检验族里剔除。</w:t>
-      </w:r>
-    </w:p>
-    <w:p>
-      <w:pPr>
-        <w:spacing w:after="52" w:line="258"/>
+        <w:t xml:space="preserve">若标准 i 逻辑上蕴含 j，这对的交互是算术恒等式，无论样本量多大都无信息，必须剔除。</w:t>
+      </w:r>
+    </w:p>
+    <w:p>
+      <w:pPr>
+        <w:spacing w:after="44" w:line="250"/>
         <w:ind w:left="300" w:hanging="300"/>
         <w:jc w:val="both"/>
       </w:pPr>
@@ -2175,7 +2399,7 @@
           <w:sz w:val="19"/>
           <w:szCs w:val="19"/>
         </w:rPr>
-        <w:t xml:space="preserve">同时报告风险比和 RMST 差。条件风险比固定为 0.6 的模拟里，一条没改变任何人相对获益的标准，其对数风险比 Shapley 值却随预后异质性从 −0.0008 长到 −0.066；异质性为零时假象消失。</w:t>
+        <w:t xml:space="preserve">同时报告风险比和 RMST 差。条件风险比固定为 0.6 的模拟里，一条没改变任何人相对获益的标准，其对数风险比 Shapley 值却随预后异质性从 −0.0008 长到 −0.066。</w:t>
       </w:r>
     </w:p>
     <w:p>
@@ -2196,7 +2420,7 @@
     </w:p>
     <w:p>
       <w:pPr>
-        <w:spacing w:after="68" w:line="254"/>
+        <w:spacing w:after="52" w:line="240"/>
         <w:jc w:val="both"/>
       </w:pPr>
       <w:r>
@@ -2263,18 +2487,18 @@
     </w:p>
     <w:p>
       <w:pPr>
-        <w:spacing w:after="68" w:line="254"/>
-        <w:jc w:val="both"/>
-      </w:pPr>
-      <w:r>
-        <w:rPr>
-          <w:rFonts w:ascii="Noto Serif CJK SC" w:cs="Noto Serif CJK SC" w:eastAsia="Noto Serif CJK SC" w:hAnsi="Noto Serif CJK SC"/>
-          <w:b w:val="false"/>
-          <w:bCs w:val="false"/>
-          <w:sz w:val="19"/>
-          <w:szCs w:val="19"/>
-        </w:rPr>
-        <w:t xml:space="preserve">因为入组人数通常不是唯一目的。规则换来的可能是估计质量，代价是比它能做到的少招一些人。但在</w:t>
+        <w:spacing w:after="52" w:line="240"/>
+        <w:jc w:val="both"/>
+      </w:pPr>
+      <w:r>
+        <w:rPr>
+          <w:rFonts w:ascii="Noto Serif CJK SC" w:cs="Noto Serif CJK SC" w:eastAsia="Noto Serif CJK SC" w:hAnsi="Noto Serif CJK SC"/>
+          <w:b w:val="false"/>
+          <w:bCs w:val="false"/>
+          <w:sz w:val="19"/>
+          <w:szCs w:val="19"/>
+        </w:rPr>
+        <w:t xml:space="preserve">因为入组人数通常不是唯一目的。规则换来的可能是估计质量，代价是少招一些人。但在</w:t>
       </w:r>
       <w:r>
         <w:rPr>
@@ -2294,7 +2518,7 @@
           <w:sz w:val="19"/>
           <w:szCs w:val="19"/>
         </w:rPr>
-        <w:t xml:space="preserve">下它是否仍有这个优势，这两个队列的规模判不出来（区间都包含 0.5）。这个取舍只跟完整方案比是显现不出来的。</w:t>
+        <w:t xml:space="preserve">下是否仍有优势，这两个队列的规模判不出来；只跟完整方案比是看不出这个取舍的。</w:t>
       </w:r>
     </w:p>
     <w:p>
@@ -2314,18 +2538,18 @@
     </w:p>
     <w:p>
       <w:pPr>
-        <w:spacing w:after="68" w:line="254"/>
-        <w:jc w:val="both"/>
-      </w:pPr>
-      <w:r>
-        <w:rPr>
-          <w:rFonts w:ascii="Noto Serif CJK SC" w:cs="Noto Serif CJK SC" w:eastAsia="Noto Serif CJK SC" w:hAnsi="Noto Serif CJK SC"/>
-          <w:b w:val="false"/>
-          <w:bCs w:val="false"/>
-          <w:sz w:val="19"/>
-          <w:szCs w:val="19"/>
-        </w:rPr>
-        <w:t xml:space="preserve">四步。（1）先把出于安全性、耐受性、给药可行性的标准标记为</w:t>
+        <w:spacing w:after="52" w:line="240"/>
+        <w:jc w:val="both"/>
+      </w:pPr>
+      <w:r>
+        <w:rPr>
+          <w:rFonts w:ascii="Noto Serif CJK SC" w:cs="Noto Serif CJK SC" w:eastAsia="Noto Serif CJK SC" w:hAnsi="Noto Serif CJK SC"/>
+          <w:b w:val="false"/>
+          <w:bCs w:val="false"/>
+          <w:sz w:val="19"/>
+          <w:szCs w:val="19"/>
+        </w:rPr>
+        <w:t xml:space="preserve">四步。（1）先把安全性、耐受性、给药可行性相关的标准标记为</w:t>
       </w:r>
       <w:r>
         <w:rPr>
@@ -2345,12 +2569,12 @@
           <w:sz w:val="19"/>
           <w:szCs w:val="19"/>
         </w:rPr>
-        <w:t xml:space="preserve">。（2）看结局之前先算交互杠杆和逻辑蕴含。（3）检查完整方案内部的正性/重叠。（4）判断有没有一条标准集中了足够差异获益；没有的话，只报告人群扩大，不报告疗效改善。</w:t>
+        <w:t xml:space="preserve">。（2）看结局之前先算交互杠杆和逻辑蕴含。（3）检查完整方案内部的重叠。（4）看有没有一条标准集中了足够差异获益；没有就只报告人群扩大，不报告疗效改善。</w:t>
       </w:r>
     </w:p>
     <w:sectPr>
       <w:pgSz w:w="12240" w:h="15840" w:orient="portrait"/>
-      <w:pgMar w:top="700" w:right="950" w:bottom="660" w:left="950" w:header="708" w:footer="708" w:gutter="0"/>
+      <w:pgMar w:top="600" w:right="860" w:bottom="540" w:left="860" w:header="708" w:footer="708" w:gutter="0"/>
       <w:pgNumType/>
       <w:docGrid w:linePitch="360"/>
     </w:sectPr>

</xml_diff>

<commit_message>
Eleventh revision: repair the audit script's own failure branch, ship the result objects it reads, and state that the three-way quantities do not share a denominator
</commit_message>
<xml_diff>
--- a/repo/explainer/文章解读_中文.docx
+++ b/repo/explainer/文章解读_中文.docx
@@ -102,7 +102,7 @@
           <w:sz w:val="19"/>
           <w:szCs w:val="19"/>
         </w:rPr>
-        <w:t xml:space="preserve">：点估计在 colon 是 63.4%、Rotterdam 是 57.1%，但把病人重抽的波动算进来之后，这个比例的中间 80% 范围约占单位区间的三分之一，且横跨 0.5。它落在「人数—风险比」经验前沿上的比例只有 3.0% 和 1.0%；不过这个前沿本身是从同一批留出数据里挑最优挑出来的，带乐观偏倚，我们另外量化了这个偏倚有多大。至于疗效估计要多少数据才够：在我们模拟的这些机制里，</w:t>
+        <w:t xml:space="preserve">：点估计在 colon 是 63.4%、Rotterdam 是 57.1%，但把病人重抽的波动算进来之后，这个比例的中间 80% 范围约占单位区间的三分之一，即对队列构成相当敏感。它落在「人数—风险比」经验前沿上的比例只有 3.0% 和 1.0%；不过这个前沿本身是从同一批留出数据里挑最优挑出来的，带乐观偏倚，我们另外量化了这个偏倚有多大。至于疗效估计要多少数据才够：在我们模拟的这些机制里，</w:t>
       </w:r>
       <w:r>
         <w:rPr>
@@ -457,27 +457,27 @@
           <w:sz w:val="19"/>
           <w:szCs w:val="19"/>
         </w:rPr>
-        <w:t xml:space="preserve">都在留出的那一半上评分（第一轮用「随机去掉同样条数」不公平，因为两者纳入的人数差很多）。在合格人数相差 10% 以内的子集中，规则的风险比更低的比例是 63.4%（colon）和 57.1%（Rotterdam），病人层面的区间分别是 [0.40, 0.86] 和 [0.39, 0.75]；在 RMST 上是 41.1% 和 59.0%。</w:t>
-      </w:r>
-      <w:r>
-        <w:rPr>
-          <w:rFonts w:ascii="Noto Sans CJK SC" w:cs="Noto Sans CJK SC" w:eastAsia="Noto Sans CJK SC" w:hAnsi="Noto Sans CJK SC"/>
-          <w:b/>
-          <w:bCs/>
-          <w:sz w:val="19"/>
-          <w:szCs w:val="19"/>
-        </w:rPr>
-        <w:t xml:space="preserve">重抽病人时这些范围各自约占单位区间的四分之一到三成，且横跨 0.5</w:t>
-      </w:r>
-      <w:r>
-        <w:rPr>
-          <w:rFonts w:ascii="Noto Serif CJK SC" w:cs="Noto Serif CJK SC" w:eastAsia="Noto Serif CJK SC" w:hAnsi="Noto Serif CJK SC"/>
-          <w:b w:val="false"/>
-          <w:bCs w:val="false"/>
-          <w:sz w:val="19"/>
-          <w:szCs w:val="19"/>
-        </w:rPr>
-        <w:t xml:space="preserve">——我们不把它当检验，也不据此对总体值下任何结论。这是我们第三轮之后最重要的一处措辞改动。</w:t>
+        <w:t xml:space="preserve">都在留出的那一半上评分（第一轮用「随机去掉同样条数」不公平，因为两者纳入的人数差很多）。在合格人数相差 10% 以内的子集中，规则的风险比更低的比例是 63.4%（colon）和 57.1%（Rotterdam），重抽病人时中间 80% 的范围分别是 [0.37–0.69] 和 [0.45–0.71]（不是置信区间）；在 RMST 上是 41.1% 和 59.0%。</w:t>
+      </w:r>
+      <w:r>
+        <w:rPr>
+          <w:rFonts w:ascii="Noto Sans CJK SC" w:cs="Noto Sans CJK SC" w:eastAsia="Noto Sans CJK SC" w:hAnsi="Noto Sans CJK SC"/>
+          <w:b/>
+          <w:bCs/>
+          <w:sz w:val="19"/>
+          <w:szCs w:val="19"/>
+        </w:rPr>
+        <w:t xml:space="preserve">重抽病人时这些范围各自约占单位区间的四分之一到三成</w:t>
+      </w:r>
+      <w:r>
+        <w:rPr>
+          <w:rFonts w:ascii="Noto Serif CJK SC" w:cs="Noto Serif CJK SC" w:eastAsia="Noto Serif CJK SC" w:hAnsi="Noto Serif CJK SC"/>
+          <w:b w:val="false"/>
+          <w:bCs w:val="false"/>
+          <w:sz w:val="19"/>
+          <w:szCs w:val="19"/>
+        </w:rPr>
+        <w:t xml:space="preserve">——我们不把它当检验，文中也没有做过任何有校准的总体层面比较。这是我们第三轮之后最重要的一处措辞改动。</w:t>
       </w:r>
     </w:p>
     <w:p>
@@ -1178,7 +1178,7 @@
           <w:sz w:val="15"/>
           <w:szCs w:val="15"/>
         </w:rPr>
-        <w:t xml:space="preserve">最后一行来自嵌套自助（150 次外层重抽 × 25 次内层划分），也是全文唯一的区间口径：外层自助分布的 95% 百分位区间。第二轮审稿指出原实现有泄漏——自助样本里同一病人的副本可能落到划分两侧；改成按病人 ID 划分后区间反而变窄。总标准差 0.194 中，内层蒙特卡洛成分 0.084、外层抽样成分 0.174。</w:t>
+        <w:t xml:space="preserve">最后一行来自嵌套自助（150 次外层重抽 × 25 次内层划分），第八轮起不再称其为区间：报告的是外层自助分布的中间 80%「患者重抽范围」，覆盖率未经验证。第二轮审稿指出原实现有泄漏——自助样本里同一病人的副本可能落到划分两侧；改成按病人 ID 划分后区间反而变窄。总标准差 0.194 中，内层蒙特卡洛成分 0.084、外层抽样成分 0.174。</w:t>
       </w:r>
     </w:p>
     <w:p>

</xml_diff>